<commit_message>
Portal: strip fakta masa 480 minit + dokumen 01 dan 04 versi 480
</commit_message>
<xml_diff>
--- a/01_Garis_Panduan_CDKK.docx
+++ b/01_Garis_Panduan_CDKK.docx
@@ -2610,7 +2610,7 @@
                 <w:szCs w:val="40"/>
                 <w:lang w:val="ms-MY"/>
               </w:rPr>
-              <w:t>300</w:t>
+              <w:t>480</w:t>
             </w:r>
           </w:p>
           <w:p>
@@ -8937,7 +8937,7 @@
           <w:szCs w:val="17"/>
           <w:lang w:val="ms-MY"/>
         </w:rPr>
-        <w:t>Rajah 4: Sprint 300 minit dan tiga hard stop pada minit 145, 235 dan 270.</w:t>
+        <w:t>Rajah 4: Sprint 480 minit dan tiga hard stop pada minit 232, 376 dan 432.</w:t>
       </w:r>
     </w:p>
     <w:p>
@@ -8966,7 +8966,7 @@
           <w:lang w:val="ms-MY"/>
         </w:rPr>
         <w:tab/>
-        <w:t>Tempoh penghasilan projek pada hari pertandingan adalah lima (5) jam atau 300 minit.</w:t>
+        <w:t>Tempoh penghasilan projek pada hari pertandingan adalah lapan (8) jam atau 480 minit, iaitu pada Sabtu 7 November 2026 (8.00 pagi hingga 4.00 petang).</w:t>
       </w:r>
     </w:p>
     <w:p>
@@ -9670,7 +9670,36 @@
           <w:lang w:val="ms-MY"/>
         </w:rPr>
         <w:tab/>
-        <w:t>Tempoh penghasilan 300 minit termasuk masa render dan export video akhir. Peserta dinasihatkan menyelesaikan editing dan mula meng-export sekurang-kurangnya tiga puluh (30) minit sebelum tamat masa bagi mengelakkan kelewatan penyerahan.</w:t>
+        <w:t>Tempoh penghasilan 480 minit termasuk masa render dan export video akhir. Peserta dinasihatkan menyelesaikan editing dan mula meng-export sekurang-kurangnya tiga puluh (30) minit sebelum tamat masa bagi mengelakkan kelewatan penyerahan.</w:t>
+      </w:r>
+    </w:p>
+    <w:p>
+      <w:pPr>
+        <w:tabs>
+          <w:tab w:val="left" w:pos="720"/>
+        </w:tabs>
+        <w:spacing w:before="60" w:after="130" w:line="320" w:lineRule="auto"/>
+        <w:ind w:left="720" w:hanging="720"/>
+        <w:jc w:val="both"/>
+        <w:rPr>
+          <w:lang w:val="ms-MY"/>
+        </w:rPr>
+      </w:pPr>
+      <w:r>
+        <w:rPr>
+          <w:b/>
+          <w:bCs/>
+          <w:color w:val="1F4E79"/>
+          <w:lang w:val="ms-MY"/>
+        </w:rPr>
+        <w:t>7.7</w:t>
+      </w:r>
+      <w:r>
+        <w:rPr>
+          <w:lang w:val="ms-MY"/>
+        </w:rPr>
+        <w:tab/>
+        <w:t>Sesi persembahan bagi Peringkat Kebangsaan dilaksanakan pada keesokan hari, iaitu Ahad 8 November 2026, bermula jam 9.00 pagi.</w:t>
       </w:r>
     </w:p>
     <w:p>
@@ -12280,7 +12309,7 @@
           <w:lang w:val="ms-MY"/>
         </w:rPr>
         <w:tab/>
-        <w:t>Tempoh penghasilan projek adalah lima (5) jam atau 300 minit.</w:t>
+        <w:t>Tempoh penghasilan projek adalah lapan (8) jam atau 480 minit, iaitu pada Sabtu 7 November 2026 (8.00 pagi hingga 4.00 petang).</w:t>
       </w:r>
     </w:p>
     <w:p>

</xml_diff>

<commit_message>
Portal: dokumen 01, 02 dan 04 versi pindaan 24 Oktober 2026
- 01 Garis Panduan (docx, pdf 31 muka): Pusingan 39, Seksyen 14.7 hingga 14.10 kad PIN juri, 15.6, Seksyen 17 keputusan seri automatik ikut wajaran
- 02 Nota Kursus (pdf 248 muka): Pusingan 40, Pindaan 1, Modul 12, Lampiran 1 dan Lampiran 4 selaras Seksyen 14 dan 17
- 04 Borang Pertandingan (docx, pdf 36 muka): Pusingan 41, Rujukan 1 Jadual 3 dan Borang 6 (kad PIN juri)
- index.html: tarikh kemas kini Oktober 2026
Fail sama dengan 00_SEMASA (MD5 01 docx 33c56dbd, 01 pdf cdab5eed, 02 pdf 4195b164, 04 docx d10765b3, 04 pdf 075e685a).

Co-Authored-By: Claude Opus 5.5 <noreply@anthropic.com>
Claude-Session: https://claude.ai/code/session_01B4ZXcZKZZemw5Hy6h3gC3G
</commit_message>
<xml_diff>
--- a/01_Garis_Panduan_CDKK.docx
+++ b/01_Garis_Panduan_CDKK.docx
@@ -194,16 +194,6 @@
                 <w:lang w:val="ms-MY"/>
               </w:rPr>
               <w:t xml:space="preserve">Pertandingan Cabaran Digital Kreatif Komuniti (CDKK) </w:t>
-            </w:r>
-            <w:r>
-              <w:rPr>
-                <w:b/>
-                <w:bCs/>
-                <w:color w:val="1F4E79"/>
-                <w:sz w:val="30"/>
-                <w:szCs w:val="30"/>
-                <w:lang w:val="ms-MY"/>
-              </w:rPr>
               <w:br/>
               <w:t>KEMAS @FESMA Tahun 2026</w:t>
             </w:r>
@@ -5468,11 +5458,6 @@
                 <w:lang w:val="ms-MY"/>
               </w:rPr>
               <w:t xml:space="preserve">Format Fail </w:t>
-            </w:r>
-            <w:r>
-              <w:rPr>
-                <w:lang w:val="ms-MY"/>
-              </w:rPr>
               <w:br/>
               <w:t>(File Compression)</w:t>
             </w:r>
@@ -5546,11 +5531,6 @@
                 <w:lang w:val="ms-MY"/>
               </w:rPr>
               <w:t xml:space="preserve">Nisbah Paparan </w:t>
-            </w:r>
-            <w:r>
-              <w:rPr>
-                <w:lang w:val="ms-MY"/>
-              </w:rPr>
               <w:br/>
               <w:t>(Aspect Ratio)</w:t>
             </w:r>
@@ -14862,6 +14842,122 @@
     </w:p>
     <w:p>
       <w:pPr>
+        <w:tabs>
+          <w:tab w:val="left" w:pos="720"/>
+        </w:tabs>
+        <w:spacing w:before="60" w:after="130" w:line="320" w:lineRule="auto"/>
+        <w:ind w:left="720" w:hanging="720"/>
+        <w:jc w:val="both"/>
+        <w:rPr>
+          <w:lang w:val="ms-MY"/>
+        </w:rPr>
+      </w:pPr>
+      <w:r>
+        <w:rPr>
+          <w:b/>
+          <w:bCs/>
+          <w:color w:val="1F4E79"/>
+          <w:lang w:val="ms-MY"/>
+        </w:rPr>
+        <w:t>14.7</w:t>
+      </w:r>
+      <w:r>
+        <w:rPr>
+          <w:lang w:val="ms-MY"/>
+        </w:rPr>
+        <w:tab/>
+        <w:t xml:space="preserve">Bagi peringkat Kebangsaan, setiap juri awam menerima satu kad PIN juri di kaunter juri awam. Kad mengandungi PIN lapan aksara dan kod QR yang membuka Borang 6 Penilaian Juri Awam dalam bentuk digital secara terus.</w:t>
+      </w:r>
+    </w:p>
+    <w:p>
+      <w:pPr>
+        <w:tabs>
+          <w:tab w:val="left" w:pos="720"/>
+        </w:tabs>
+        <w:spacing w:before="60" w:after="130" w:line="320" w:lineRule="auto"/>
+        <w:ind w:left="720" w:hanging="720"/>
+        <w:jc w:val="both"/>
+        <w:rPr>
+          <w:lang w:val="ms-MY"/>
+        </w:rPr>
+      </w:pPr>
+      <w:r>
+        <w:rPr>
+          <w:b/>
+          <w:bCs/>
+          <w:color w:val="1F4E79"/>
+          <w:lang w:val="ms-MY"/>
+        </w:rPr>
+        <w:t>14.8</w:t>
+      </w:r>
+      <w:r>
+        <w:rPr>
+          <w:lang w:val="ms-MY"/>
+        </w:rPr>
+        <w:tab/>
+        <w:t xml:space="preserve">Nama juri diikat pada kad apabila kad digunakan buat kali pertama. Satu kad hanya boleh mengundi satu kali bagi setiap kumpulan. Pembetulan nama tidak membuka undian kedua.</w:t>
+      </w:r>
+    </w:p>
+    <w:p>
+      <w:pPr>
+        <w:tabs>
+          <w:tab w:val="left" w:pos="720"/>
+        </w:tabs>
+        <w:spacing w:before="60" w:after="130" w:line="320" w:lineRule="auto"/>
+        <w:ind w:left="720" w:hanging="720"/>
+        <w:jc w:val="both"/>
+        <w:rPr>
+          <w:lang w:val="ms-MY"/>
+        </w:rPr>
+      </w:pPr>
+      <w:r>
+        <w:rPr>
+          <w:b/>
+          <w:bCs/>
+          <w:color w:val="1F4E79"/>
+          <w:lang w:val="ms-MY"/>
+        </w:rPr>
+        <w:t>14.9</w:t>
+      </w:r>
+      <w:r>
+        <w:rPr>
+          <w:lang w:val="ms-MY"/>
+        </w:rPr>
+        <w:tab/>
+        <w:t xml:space="preserve">Kad yang hilang atau disalah guna dibatalkan oleh urus setia. Undian daripada kad yang dibatalkan tidak dikira dalam Anugerah Pilihan Juri Awam.</w:t>
+      </w:r>
+    </w:p>
+    <w:p>
+      <w:pPr>
+        <w:tabs>
+          <w:tab w:val="left" w:pos="720"/>
+        </w:tabs>
+        <w:spacing w:before="60" w:after="130" w:line="320" w:lineRule="auto"/>
+        <w:ind w:left="720" w:hanging="720"/>
+        <w:jc w:val="both"/>
+        <w:rPr>
+          <w:lang w:val="ms-MY"/>
+        </w:rPr>
+      </w:pPr>
+      <w:r>
+        <w:rPr>
+          <w:b/>
+          <w:bCs/>
+          <w:color w:val="1F4E79"/>
+          <w:lang w:val="ms-MY"/>
+        </w:rPr>
+        <w:t>14.10</w:t>
+      </w:r>
+      <w:r>
+        <w:rPr>
+          <w:lang w:val="ms-MY"/>
+        </w:rPr>
+        <w:tab/>
+        <w:t xml:space="preserve">Undian dibuka dan ditutup oleh urus setia. Undian yang dihantar selepas sesi ditutup tidak diterima. Anugerah Pilihan Juri Awam kekal berasingan daripada markah panel hakim dan tidak mempengaruhi kedudukan rasmi.</w:t>
+      </w:r>
+    </w:p>
+    <w:p>
+      <w:pPr>
         <w:spacing w:after="80"/>
         <w:rPr>
           <w:lang w:val="ms-MY"/>
@@ -15250,7 +15346,7 @@
           <w:lang w:val="ms-MY"/>
         </w:rPr>
         <w:tab/>
-        <w:t>Markah akhir setiap kumpulan ialah purata (min) jumlah markah semua hakim dalam panel. Bagi kes sempadan atau seri, panel berbincang secara kolektif untuk mencapai keputusan. Semua markah hendaklah dikira dan disahkan semula oleh dua orang urus setia.</w:t>
+        <w:t>Markah akhir setiap kumpulan ialah purata (min) jumlah markah semua hakim dalam panel. Bagi kes sempadan, panel berbincang secara kolektif untuk mencapai keputusan. Kes seri diselesaikan mengikut Seksyen 17. Semua markah hendaklah dikira dan disahkan semula oleh dua orang urus setia.</w:t>
       </w:r>
     </w:p>
     <w:p>
@@ -17058,214 +17154,7 @@
           <w:lang w:val="ms-MY"/>
         </w:rPr>
         <w:tab/>
-        <w:t>Sekiranya berlaku persamaan markah, pemenang akan ditentukan berdasarkan markah tertinggi mengikut turutan berikut:</w:t>
-      </w:r>
-    </w:p>
-    <w:p>
-      <w:pPr>
-        <w:pStyle w:val="ListParagraph"/>
-        <w:numPr>
-          <w:ilvl w:val="0"/>
-          <w:numId w:val="4"/>
-        </w:numPr>
-        <w:tabs>
-          <w:tab w:val="left" w:pos="1080"/>
-        </w:tabs>
-        <w:spacing w:before="40" w:after="60" w:line="300" w:lineRule="auto"/>
-        <w:jc w:val="both"/>
-        <w:rPr>
-          <w:lang w:val="ms-MY"/>
-        </w:rPr>
-      </w:pPr>
-      <w:r>
-        <w:rPr>
-          <w:lang w:val="ms-MY"/>
-        </w:rPr>
-        <w:t>Kreativiti konsep dan visual</w:t>
-      </w:r>
-    </w:p>
-    <w:p>
-      <w:pPr>
-        <w:pStyle w:val="ListParagraph"/>
-        <w:numPr>
-          <w:ilvl w:val="0"/>
-          <w:numId w:val="4"/>
-        </w:numPr>
-        <w:tabs>
-          <w:tab w:val="left" w:pos="1080"/>
-        </w:tabs>
-        <w:spacing w:before="40" w:after="60" w:line="300" w:lineRule="auto"/>
-        <w:jc w:val="both"/>
-        <w:rPr>
-          <w:lang w:val="ms-MY"/>
-        </w:rPr>
-      </w:pPr>
-      <w:r>
-        <w:rPr>
-          <w:lang w:val="ms-MY"/>
-        </w:rPr>
-        <w:t>Kandungan, fakta dan mesej</w:t>
-      </w:r>
-    </w:p>
-    <w:p>
-      <w:pPr>
-        <w:pStyle w:val="ListParagraph"/>
-        <w:numPr>
-          <w:ilvl w:val="0"/>
-          <w:numId w:val="4"/>
-        </w:numPr>
-        <w:tabs>
-          <w:tab w:val="left" w:pos="1080"/>
-        </w:tabs>
-        <w:spacing w:before="40" w:after="60" w:line="300" w:lineRule="auto"/>
-        <w:jc w:val="both"/>
-        <w:rPr>
-          <w:lang w:val="ms-MY"/>
-        </w:rPr>
-      </w:pPr>
-      <w:r>
-        <w:rPr>
-          <w:lang w:val="ms-MY"/>
-        </w:rPr>
-        <w:t>Penggunaan Canva</w:t>
-      </w:r>
-    </w:p>
-    <w:p>
-      <w:pPr>
-        <w:pStyle w:val="ListParagraph"/>
-        <w:numPr>
-          <w:ilvl w:val="0"/>
-          <w:numId w:val="4"/>
-        </w:numPr>
-        <w:tabs>
-          <w:tab w:val="left" w:pos="1080"/>
-        </w:tabs>
-        <w:spacing w:before="40" w:after="60" w:line="300" w:lineRule="auto"/>
-        <w:jc w:val="both"/>
-        <w:rPr>
-          <w:lang w:val="ms-MY"/>
-        </w:rPr>
-      </w:pPr>
-      <w:r>
-        <w:rPr>
-          <w:lang w:val="ms-MY"/>
-        </w:rPr>
-        <w:t>Penggunaan AI</w:t>
-      </w:r>
-    </w:p>
-    <w:p>
-      <w:pPr>
-        <w:pStyle w:val="ListParagraph"/>
-        <w:numPr>
-          <w:ilvl w:val="0"/>
-          <w:numId w:val="4"/>
-        </w:numPr>
-        <w:tabs>
-          <w:tab w:val="left" w:pos="1080"/>
-        </w:tabs>
-        <w:spacing w:before="40" w:after="60" w:line="300" w:lineRule="auto"/>
-        <w:jc w:val="both"/>
-        <w:rPr>
-          <w:lang w:val="ms-MY"/>
-        </w:rPr>
-      </w:pPr>
-      <w:r>
-        <w:rPr>
-          <w:lang w:val="ms-MY"/>
-        </w:rPr>
-        <w:t>Suntingan CapCut dan video</w:t>
-      </w:r>
-    </w:p>
-    <w:p>
-      <w:pPr>
-        <w:pStyle w:val="ListParagraph"/>
-        <w:numPr>
-          <w:ilvl w:val="0"/>
-          <w:numId w:val="4"/>
-        </w:numPr>
-        <w:tabs>
-          <w:tab w:val="left" w:pos="1080"/>
-        </w:tabs>
-        <w:spacing w:before="40" w:after="60" w:line="300" w:lineRule="auto"/>
-        <w:jc w:val="both"/>
-        <w:rPr>
-          <w:lang w:val="ms-MY"/>
-        </w:rPr>
-      </w:pPr>
-      <w:r>
-        <w:rPr>
-          <w:lang w:val="ms-MY"/>
-        </w:rPr>
-        <w:t>Audio (lagu, muzik, sound effects dan suara)</w:t>
-      </w:r>
-    </w:p>
-    <w:p>
-      <w:pPr>
-        <w:pStyle w:val="ListParagraph"/>
-        <w:numPr>
-          <w:ilvl w:val="0"/>
-          <w:numId w:val="4"/>
-        </w:numPr>
-        <w:tabs>
-          <w:tab w:val="left" w:pos="1080"/>
-        </w:tabs>
-        <w:spacing w:before="40" w:after="60" w:line="300" w:lineRule="auto"/>
-        <w:jc w:val="both"/>
-        <w:rPr>
-          <w:lang w:val="ms-MY"/>
-        </w:rPr>
-      </w:pPr>
-      <w:r>
-        <w:rPr>
-          <w:lang w:val="ms-MY"/>
-        </w:rPr>
-        <w:t>Etika, sumber dan deklarasi AI</w:t>
-      </w:r>
-    </w:p>
-    <w:p>
-      <w:pPr>
-        <w:pStyle w:val="ListParagraph"/>
-        <w:numPr>
-          <w:ilvl w:val="0"/>
-          <w:numId w:val="4"/>
-        </w:numPr>
-        <w:tabs>
-          <w:tab w:val="left" w:pos="1080"/>
-        </w:tabs>
-        <w:spacing w:before="40" w:after="60" w:line="300" w:lineRule="auto"/>
-        <w:jc w:val="both"/>
-        <w:rPr>
-          <w:lang w:val="ms-MY"/>
-        </w:rPr>
-      </w:pPr>
-      <w:r>
-        <w:rPr>
-          <w:lang w:val="ms-MY"/>
-        </w:rPr>
-        <w:t>Persembahan dan soal jawab</w:t>
-      </w:r>
-    </w:p>
-    <w:p>
-      <w:pPr>
-        <w:pStyle w:val="ListParagraph"/>
-        <w:numPr>
-          <w:ilvl w:val="0"/>
-          <w:numId w:val="4"/>
-        </w:numPr>
-        <w:tabs>
-          <w:tab w:val="left" w:pos="1080"/>
-        </w:tabs>
-        <w:spacing w:before="40" w:after="60" w:line="300" w:lineRule="auto"/>
-        <w:jc w:val="both"/>
-        <w:rPr>
-          <w:lang w:val="ms-MY"/>
-        </w:rPr>
-      </w:pPr>
-      <w:r>
-        <w:rPr>
-          <w:lang w:val="ms-MY"/>
-        </w:rPr>
-        <w:t>Watak AURORA</w:t>
+        <w:t xml:space="preserve">Markah akhir setiap kumpulan ialah purata jumlah markah ketiga-tiga hakim, ditolak penalti peringkat jumlah yang telah disahkan, selaras dengan Seksyen 15.6.</w:t>
       </w:r>
     </w:p>
     <w:p>
@@ -17294,7 +17183,1576 @@
           <w:lang w:val="ms-MY"/>
         </w:rPr>
         <w:tab/>
-        <w:t>Keputusan akhir akan ditentukan oleh ketua hakim setelah mengambil kira pandangan panel hakim.</w:t>
+        <w:t xml:space="preserve">Sekiranya dua atau lebih kumpulan memperoleh markah akhir yang sama hingga dua tempat perpuluhan, kedudukan ditentukan mengikut jumlah markah setiap komponen daripada ketiga-tiga hakim, dibandingkan satu demi satu mengikut susunan keutamaan dalam jadual di perenggan 17.3. Kumpulan yang memperoleh jumlah lebih tinggi pada komponen pertama yang berbeza diletakkan pada kedudukan yang lebih tinggi.</w:t>
+      </w:r>
+    </w:p>
+    <w:p>
+      <w:pPr>
+        <w:tabs>
+          <w:tab w:val="left" w:pos="720"/>
+        </w:tabs>
+        <w:spacing w:before="60" w:after="130" w:line="320" w:lineRule="auto"/>
+        <w:ind w:left="720" w:hanging="720"/>
+        <w:jc w:val="both"/>
+        <w:rPr>
+          <w:lang w:val="ms-MY"/>
+        </w:rPr>
+      </w:pPr>
+      <w:r>
+        <w:rPr>
+          <w:b/>
+          <w:bCs/>
+          <w:color w:val="1F4E79"/>
+          <w:lang w:val="ms-MY"/>
+        </w:rPr>
+        <w:t>17.3</w:t>
+      </w:r>
+      <w:r>
+        <w:rPr>
+          <w:lang w:val="ms-MY"/>
+        </w:rPr>
+        <w:tab/>
+        <w:t xml:space="preserve">Susunan keutamaan mengikut wajaran markah komponen. Komponen yang sama wajaran disusun mengikut nombor komponen. Komponen 8 Persembahan dan soal jawab (10 markah) oleh itu didahulukan berbanding Komponen 7 Etika, sumber dan deklarasi AI (5 markah).</w:t>
+      </w:r>
+    </w:p>
+    <w:tbl>
+      <w:tblPr>
+        <w:tblW w:w="9026" w:type="dxa"/>
+        <w:tblBorders>
+          <w:top w:val="single" w:sz="4" w:space="0" w:color="auto"/>
+          <w:left w:val="single" w:sz="4" w:space="0" w:color="auto"/>
+          <w:bottom w:val="single" w:sz="4" w:space="0" w:color="auto"/>
+          <w:right w:val="single" w:sz="4" w:space="0" w:color="auto"/>
+          <w:insideH w:val="single" w:sz="4" w:space="0" w:color="auto"/>
+          <w:insideV w:val="single" w:sz="4" w:space="0" w:color="auto"/>
+        </w:tblBorders>
+        <w:tblLayout w:type="fixed"/>
+        <w:tblCellMar>
+          <w:left w:w="10" w:type="dxa"/>
+          <w:right w:w="10" w:type="dxa"/>
+        </w:tblCellMar>
+        <w:tblLook w:val="04A0" w:firstRow="1" w:lastRow="0" w:firstColumn="1" w:lastColumn="0" w:noHBand="0" w:noVBand="1"/>
+      </w:tblPr>
+      <w:tblGrid>
+        <w:gridCol w:w="1400"/>
+        <w:gridCol w:w="4826"/>
+        <w:gridCol w:w="1300"/>
+        <w:gridCol w:w="1500"/>
+      </w:tblGrid>
+      <w:tr>
+        <w:trPr>
+          <w:cantSplit/>
+          <w:trHeight w:val="432"/>
+          <w:tblHeader/>
+        </w:trPr>
+        <w:tc>
+          <w:tcPr>
+            <w:tcW w:w="1400" w:type="dxa"/>
+            <w:tcBorders>
+              <w:top w:val="single" w:sz="4" w:space="0" w:color="C9CFD8"/>
+              <w:left w:val="single" w:sz="4" w:space="0" w:color="C9CFD8"/>
+              <w:bottom w:val="single" w:sz="12" w:space="0" w:color="B8860B"/>
+              <w:right w:val="single" w:sz="4" w:space="0" w:color="C9CFD8"/>
+            </w:tcBorders>
+            <w:shd w:val="clear" w:color="auto" w:fill="1F4E79"/>
+            <w:tcMar>
+              <w:top w:w="50" w:type="dxa"/>
+              <w:left w:w="60" w:type="dxa"/>
+              <w:bottom w:w="50" w:type="dxa"/>
+              <w:right w:w="60" w:type="dxa"/>
+            </w:tcMar>
+            <w:vAlign w:val="center"/>
+          </w:tcPr>
+          <w:p>
+            <w:pPr>
+              <w:keepNext/>
+              <w:spacing w:line="254" w:lineRule="auto"/>
+              <w:jc w:val="center"/>
+              <w:rPr>
+                <w:b/>
+                <w:bCs/>
+                <w:color w:val="FFFFFF"/>
+                <w:lang w:val="ms-MY"/>
+              </w:rPr>
+            </w:pPr>
+            <w:r>
+              <w:rPr>
+                <w:b/>
+                <w:bCs/>
+                <w:color w:val="FFFFFF"/>
+                <w:lang w:val="ms-MY"/>
+              </w:rPr>
+              <w:t>Keutamaan</w:t>
+            </w:r>
+          </w:p>
+        </w:tc>
+        <w:tc>
+          <w:tcPr>
+            <w:tcW w:w="4826" w:type="dxa"/>
+            <w:tcBorders>
+              <w:top w:val="single" w:sz="4" w:space="0" w:color="C9CFD8"/>
+              <w:left w:val="single" w:sz="4" w:space="0" w:color="C9CFD8"/>
+              <w:bottom w:val="single" w:sz="12" w:space="0" w:color="B8860B"/>
+              <w:right w:val="single" w:sz="4" w:space="0" w:color="C9CFD8"/>
+            </w:tcBorders>
+            <w:shd w:val="clear" w:color="auto" w:fill="1F4E79"/>
+            <w:tcMar>
+              <w:top w:w="50" w:type="dxa"/>
+              <w:left w:w="60" w:type="dxa"/>
+              <w:bottom w:w="50" w:type="dxa"/>
+              <w:right w:w="60" w:type="dxa"/>
+            </w:tcMar>
+            <w:vAlign w:val="center"/>
+          </w:tcPr>
+          <w:p>
+            <w:pPr>
+              <w:keepNext/>
+              <w:spacing w:line="254" w:lineRule="auto"/>
+              <w:jc w:val="center"/>
+              <w:rPr>
+                <w:b/>
+                <w:bCs/>
+                <w:color w:val="FFFFFF"/>
+                <w:lang w:val="ms-MY"/>
+              </w:rPr>
+            </w:pPr>
+            <w:r>
+              <w:rPr>
+                <w:b/>
+                <w:bCs/>
+                <w:color w:val="FFFFFF"/>
+                <w:lang w:val="ms-MY"/>
+              </w:rPr>
+              <w:t>Komponen</w:t>
+            </w:r>
+          </w:p>
+        </w:tc>
+        <w:tc>
+          <w:tcPr>
+            <w:tcW w:w="1300" w:type="dxa"/>
+            <w:tcBorders>
+              <w:top w:val="single" w:sz="4" w:space="0" w:color="C9CFD8"/>
+              <w:left w:val="single" w:sz="4" w:space="0" w:color="C9CFD8"/>
+              <w:bottom w:val="single" w:sz="12" w:space="0" w:color="B8860B"/>
+              <w:right w:val="single" w:sz="4" w:space="0" w:color="C9CFD8"/>
+            </w:tcBorders>
+            <w:shd w:val="clear" w:color="auto" w:fill="1F4E79"/>
+            <w:tcMar>
+              <w:top w:w="50" w:type="dxa"/>
+              <w:left w:w="60" w:type="dxa"/>
+              <w:bottom w:w="50" w:type="dxa"/>
+              <w:right w:w="60" w:type="dxa"/>
+            </w:tcMar>
+            <w:vAlign w:val="center"/>
+          </w:tcPr>
+          <w:p>
+            <w:pPr>
+              <w:keepNext/>
+              <w:spacing w:line="254" w:lineRule="auto"/>
+              <w:jc w:val="center"/>
+              <w:rPr>
+                <w:b/>
+                <w:bCs/>
+                <w:color w:val="FFFFFF"/>
+                <w:lang w:val="ms-MY"/>
+              </w:rPr>
+            </w:pPr>
+            <w:r>
+              <w:rPr>
+                <w:b/>
+                <w:bCs/>
+                <w:color w:val="FFFFFF"/>
+                <w:lang w:val="ms-MY"/>
+              </w:rPr>
+              <w:t>Wajaran</w:t>
+            </w:r>
+          </w:p>
+        </w:tc>
+        <w:tc>
+          <w:tcPr>
+            <w:tcW w:w="1500" w:type="dxa"/>
+            <w:tcBorders>
+              <w:top w:val="single" w:sz="4" w:space="0" w:color="C9CFD8"/>
+              <w:left w:val="single" w:sz="4" w:space="0" w:color="C9CFD8"/>
+              <w:bottom w:val="single" w:sz="12" w:space="0" w:color="B8860B"/>
+              <w:right w:val="single" w:sz="4" w:space="0" w:color="C9CFD8"/>
+            </w:tcBorders>
+            <w:shd w:val="clear" w:color="auto" w:fill="1F4E79"/>
+            <w:tcMar>
+              <w:top w:w="50" w:type="dxa"/>
+              <w:left w:w="60" w:type="dxa"/>
+              <w:bottom w:w="50" w:type="dxa"/>
+              <w:right w:w="60" w:type="dxa"/>
+            </w:tcMar>
+            <w:vAlign w:val="center"/>
+          </w:tcPr>
+          <w:p>
+            <w:pPr>
+              <w:keepNext/>
+              <w:spacing w:line="254" w:lineRule="auto"/>
+              <w:jc w:val="center"/>
+              <w:rPr>
+                <w:b/>
+                <w:bCs/>
+                <w:color w:val="FFFFFF"/>
+                <w:lang w:val="ms-MY"/>
+              </w:rPr>
+            </w:pPr>
+            <w:r>
+              <w:rPr>
+                <w:b/>
+                <w:bCs/>
+                <w:color w:val="FFFFFF"/>
+                <w:lang w:val="ms-MY"/>
+              </w:rPr>
+              <w:t>Nombor komponen</w:t>
+            </w:r>
+          </w:p>
+        </w:tc>
+      </w:tr>
+      <w:tr>
+        <w:trPr>
+          <w:cantSplit/>
+          <w:trHeight w:val="432"/>
+        </w:trPr>
+        <w:tc>
+          <w:tcPr>
+            <w:tcW w:w="1400" w:type="dxa"/>
+            <w:tcBorders>
+              <w:top w:val="single" w:sz="4" w:space="0" w:color="C9CFD8"/>
+              <w:left w:val="single" w:sz="4" w:space="0" w:color="C9CFD8"/>
+              <w:bottom w:val="single" w:sz="4" w:space="0" w:color="C9CFD8"/>
+              <w:right w:val="single" w:sz="4" w:space="0" w:color="C9CFD8"/>
+            </w:tcBorders>
+            <w:tcMar>
+              <w:top w:w="90" w:type="dxa"/>
+              <w:left w:w="120" w:type="dxa"/>
+              <w:bottom w:w="90" w:type="dxa"/>
+              <w:right w:w="120" w:type="dxa"/>
+            </w:tcMar>
+            <w:vAlign w:val="center"/>
+          </w:tcPr>
+          <w:p>
+            <w:pPr>
+              <w:spacing w:line="254" w:lineRule="auto"/>
+              <w:jc w:val="center"/>
+              <w:rPr>
+                <w:lang w:val="ms-MY"/>
+              </w:rPr>
+            </w:pPr>
+            <w:r>
+              <w:rPr>
+                <w:lang w:val="ms-MY"/>
+              </w:rPr>
+              <w:t>1</w:t>
+            </w:r>
+          </w:p>
+        </w:tc>
+        <w:tc>
+          <w:tcPr>
+            <w:tcW w:w="4826" w:type="dxa"/>
+            <w:tcBorders>
+              <w:top w:val="single" w:sz="4" w:space="0" w:color="C9CFD8"/>
+              <w:left w:val="single" w:sz="4" w:space="0" w:color="C9CFD8"/>
+              <w:bottom w:val="single" w:sz="4" w:space="0" w:color="C9CFD8"/>
+              <w:right w:val="single" w:sz="4" w:space="0" w:color="C9CFD8"/>
+            </w:tcBorders>
+            <w:tcMar>
+              <w:top w:w="90" w:type="dxa"/>
+              <w:left w:w="120" w:type="dxa"/>
+              <w:bottom w:w="90" w:type="dxa"/>
+              <w:right w:w="120" w:type="dxa"/>
+            </w:tcMar>
+            <w:vAlign w:val="center"/>
+          </w:tcPr>
+          <w:p>
+            <w:pPr>
+              <w:spacing w:line="254" w:lineRule="auto"/>
+              <w:rPr>
+                <w:lang w:val="ms-MY"/>
+              </w:rPr>
+            </w:pPr>
+            <w:r>
+              <w:rPr>
+                <w:lang w:val="ms-MY"/>
+              </w:rPr>
+              <w:t>Kreativiti konsep dan visual</w:t>
+            </w:r>
+          </w:p>
+        </w:tc>
+        <w:tc>
+          <w:tcPr>
+            <w:tcW w:w="1300" w:type="dxa"/>
+            <w:tcBorders>
+              <w:top w:val="single" w:sz="4" w:space="0" w:color="C9CFD8"/>
+              <w:left w:val="single" w:sz="4" w:space="0" w:color="C9CFD8"/>
+              <w:bottom w:val="single" w:sz="4" w:space="0" w:color="C9CFD8"/>
+              <w:right w:val="single" w:sz="4" w:space="0" w:color="C9CFD8"/>
+            </w:tcBorders>
+            <w:tcMar>
+              <w:top w:w="90" w:type="dxa"/>
+              <w:left w:w="120" w:type="dxa"/>
+              <w:bottom w:w="90" w:type="dxa"/>
+              <w:right w:w="120" w:type="dxa"/>
+            </w:tcMar>
+            <w:vAlign w:val="center"/>
+          </w:tcPr>
+          <w:p>
+            <w:pPr>
+              <w:spacing w:line="254" w:lineRule="auto"/>
+              <w:jc w:val="center"/>
+              <w:rPr>
+                <w:lang w:val="ms-MY"/>
+              </w:rPr>
+            </w:pPr>
+            <w:r>
+              <w:rPr>
+                <w:lang w:val="ms-MY"/>
+              </w:rPr>
+              <w:t>20</w:t>
+            </w:r>
+          </w:p>
+        </w:tc>
+        <w:tc>
+          <w:tcPr>
+            <w:tcW w:w="1500" w:type="dxa"/>
+            <w:tcBorders>
+              <w:top w:val="single" w:sz="4" w:space="0" w:color="C9CFD8"/>
+              <w:left w:val="single" w:sz="4" w:space="0" w:color="C9CFD8"/>
+              <w:bottom w:val="single" w:sz="4" w:space="0" w:color="C9CFD8"/>
+              <w:right w:val="single" w:sz="4" w:space="0" w:color="C9CFD8"/>
+            </w:tcBorders>
+            <w:tcMar>
+              <w:top w:w="90" w:type="dxa"/>
+              <w:left w:w="120" w:type="dxa"/>
+              <w:bottom w:w="90" w:type="dxa"/>
+              <w:right w:w="120" w:type="dxa"/>
+            </w:tcMar>
+            <w:vAlign w:val="center"/>
+          </w:tcPr>
+          <w:p>
+            <w:pPr>
+              <w:spacing w:line="254" w:lineRule="auto"/>
+              <w:jc w:val="center"/>
+              <w:rPr>
+                <w:lang w:val="ms-MY"/>
+              </w:rPr>
+            </w:pPr>
+            <w:r>
+              <w:rPr>
+                <w:lang w:val="ms-MY"/>
+              </w:rPr>
+              <w:t>1</w:t>
+            </w:r>
+          </w:p>
+        </w:tc>
+      </w:tr>
+      <w:tr>
+        <w:trPr>
+          <w:cantSplit/>
+          <w:trHeight w:val="432"/>
+        </w:trPr>
+        <w:tc>
+          <w:tcPr>
+            <w:tcW w:w="1400" w:type="dxa"/>
+            <w:tcBorders>
+              <w:top w:val="single" w:sz="4" w:space="0" w:color="C9CFD8"/>
+              <w:left w:val="single" w:sz="4" w:space="0" w:color="C9CFD8"/>
+              <w:bottom w:val="single" w:sz="4" w:space="0" w:color="C9CFD8"/>
+              <w:right w:val="single" w:sz="4" w:space="0" w:color="C9CFD8"/>
+            </w:tcBorders>
+            <w:shd w:val="clear" w:color="auto" w:fill="EBF0F7"/>
+            <w:tcMar>
+              <w:top w:w="90" w:type="dxa"/>
+              <w:left w:w="120" w:type="dxa"/>
+              <w:bottom w:w="90" w:type="dxa"/>
+              <w:right w:w="120" w:type="dxa"/>
+            </w:tcMar>
+            <w:vAlign w:val="center"/>
+          </w:tcPr>
+          <w:p>
+            <w:pPr>
+              <w:spacing w:line="254" w:lineRule="auto"/>
+              <w:jc w:val="center"/>
+              <w:rPr>
+                <w:lang w:val="ms-MY"/>
+              </w:rPr>
+            </w:pPr>
+            <w:r>
+              <w:rPr>
+                <w:lang w:val="ms-MY"/>
+              </w:rPr>
+              <w:t>2</w:t>
+            </w:r>
+          </w:p>
+        </w:tc>
+        <w:tc>
+          <w:tcPr>
+            <w:tcW w:w="4826" w:type="dxa"/>
+            <w:tcBorders>
+              <w:top w:val="single" w:sz="4" w:space="0" w:color="C9CFD8"/>
+              <w:left w:val="single" w:sz="4" w:space="0" w:color="C9CFD8"/>
+              <w:bottom w:val="single" w:sz="4" w:space="0" w:color="C9CFD8"/>
+              <w:right w:val="single" w:sz="4" w:space="0" w:color="C9CFD8"/>
+            </w:tcBorders>
+            <w:shd w:val="clear" w:color="auto" w:fill="EBF0F7"/>
+            <w:tcMar>
+              <w:top w:w="90" w:type="dxa"/>
+              <w:left w:w="120" w:type="dxa"/>
+              <w:bottom w:w="90" w:type="dxa"/>
+              <w:right w:w="120" w:type="dxa"/>
+            </w:tcMar>
+            <w:vAlign w:val="center"/>
+          </w:tcPr>
+          <w:p>
+            <w:pPr>
+              <w:spacing w:line="254" w:lineRule="auto"/>
+              <w:rPr>
+                <w:lang w:val="ms-MY"/>
+              </w:rPr>
+            </w:pPr>
+            <w:r>
+              <w:rPr>
+                <w:lang w:val="ms-MY"/>
+              </w:rPr>
+              <w:t>Kandungan, fakta dan mesej</w:t>
+            </w:r>
+          </w:p>
+        </w:tc>
+        <w:tc>
+          <w:tcPr>
+            <w:tcW w:w="1300" w:type="dxa"/>
+            <w:tcBorders>
+              <w:top w:val="single" w:sz="4" w:space="0" w:color="C9CFD8"/>
+              <w:left w:val="single" w:sz="4" w:space="0" w:color="C9CFD8"/>
+              <w:bottom w:val="single" w:sz="4" w:space="0" w:color="C9CFD8"/>
+              <w:right w:val="single" w:sz="4" w:space="0" w:color="C9CFD8"/>
+            </w:tcBorders>
+            <w:shd w:val="clear" w:color="auto" w:fill="EBF0F7"/>
+            <w:tcMar>
+              <w:top w:w="90" w:type="dxa"/>
+              <w:left w:w="120" w:type="dxa"/>
+              <w:bottom w:w="90" w:type="dxa"/>
+              <w:right w:w="120" w:type="dxa"/>
+            </w:tcMar>
+            <w:vAlign w:val="center"/>
+          </w:tcPr>
+          <w:p>
+            <w:pPr>
+              <w:spacing w:line="254" w:lineRule="auto"/>
+              <w:jc w:val="center"/>
+              <w:rPr>
+                <w:lang w:val="ms-MY"/>
+              </w:rPr>
+            </w:pPr>
+            <w:r>
+              <w:rPr>
+                <w:lang w:val="ms-MY"/>
+              </w:rPr>
+              <w:t>15</w:t>
+            </w:r>
+          </w:p>
+        </w:tc>
+        <w:tc>
+          <w:tcPr>
+            <w:tcW w:w="1500" w:type="dxa"/>
+            <w:tcBorders>
+              <w:top w:val="single" w:sz="4" w:space="0" w:color="C9CFD8"/>
+              <w:left w:val="single" w:sz="4" w:space="0" w:color="C9CFD8"/>
+              <w:bottom w:val="single" w:sz="4" w:space="0" w:color="C9CFD8"/>
+              <w:right w:val="single" w:sz="4" w:space="0" w:color="C9CFD8"/>
+            </w:tcBorders>
+            <w:shd w:val="clear" w:color="auto" w:fill="EBF0F7"/>
+            <w:tcMar>
+              <w:top w:w="90" w:type="dxa"/>
+              <w:left w:w="120" w:type="dxa"/>
+              <w:bottom w:w="90" w:type="dxa"/>
+              <w:right w:w="120" w:type="dxa"/>
+            </w:tcMar>
+            <w:vAlign w:val="center"/>
+          </w:tcPr>
+          <w:p>
+            <w:pPr>
+              <w:spacing w:line="254" w:lineRule="auto"/>
+              <w:jc w:val="center"/>
+              <w:rPr>
+                <w:lang w:val="ms-MY"/>
+              </w:rPr>
+            </w:pPr>
+            <w:r>
+              <w:rPr>
+                <w:lang w:val="ms-MY"/>
+              </w:rPr>
+              <w:t>2</w:t>
+            </w:r>
+          </w:p>
+        </w:tc>
+      </w:tr>
+      <w:tr>
+        <w:trPr>
+          <w:cantSplit/>
+          <w:trHeight w:val="432"/>
+        </w:trPr>
+        <w:tc>
+          <w:tcPr>
+            <w:tcW w:w="1400" w:type="dxa"/>
+            <w:tcBorders>
+              <w:top w:val="single" w:sz="4" w:space="0" w:color="C9CFD8"/>
+              <w:left w:val="single" w:sz="4" w:space="0" w:color="C9CFD8"/>
+              <w:bottom w:val="single" w:sz="4" w:space="0" w:color="C9CFD8"/>
+              <w:right w:val="single" w:sz="4" w:space="0" w:color="C9CFD8"/>
+            </w:tcBorders>
+            <w:tcMar>
+              <w:top w:w="90" w:type="dxa"/>
+              <w:left w:w="120" w:type="dxa"/>
+              <w:bottom w:w="90" w:type="dxa"/>
+              <w:right w:w="120" w:type="dxa"/>
+            </w:tcMar>
+            <w:vAlign w:val="center"/>
+          </w:tcPr>
+          <w:p>
+            <w:pPr>
+              <w:spacing w:line="254" w:lineRule="auto"/>
+              <w:jc w:val="center"/>
+              <w:rPr>
+                <w:lang w:val="ms-MY"/>
+              </w:rPr>
+            </w:pPr>
+            <w:r>
+              <w:rPr>
+                <w:lang w:val="ms-MY"/>
+              </w:rPr>
+              <w:t>3</w:t>
+            </w:r>
+          </w:p>
+        </w:tc>
+        <w:tc>
+          <w:tcPr>
+            <w:tcW w:w="4826" w:type="dxa"/>
+            <w:tcBorders>
+              <w:top w:val="single" w:sz="4" w:space="0" w:color="C9CFD8"/>
+              <w:left w:val="single" w:sz="4" w:space="0" w:color="C9CFD8"/>
+              <w:bottom w:val="single" w:sz="4" w:space="0" w:color="C9CFD8"/>
+              <w:right w:val="single" w:sz="4" w:space="0" w:color="C9CFD8"/>
+            </w:tcBorders>
+            <w:tcMar>
+              <w:top w:w="90" w:type="dxa"/>
+              <w:left w:w="120" w:type="dxa"/>
+              <w:bottom w:w="90" w:type="dxa"/>
+              <w:right w:w="120" w:type="dxa"/>
+            </w:tcMar>
+            <w:vAlign w:val="center"/>
+          </w:tcPr>
+          <w:p>
+            <w:pPr>
+              <w:spacing w:line="254" w:lineRule="auto"/>
+              <w:rPr>
+                <w:lang w:val="ms-MY"/>
+              </w:rPr>
+            </w:pPr>
+            <w:r>
+              <w:rPr>
+                <w:lang w:val="ms-MY"/>
+              </w:rPr>
+              <w:t>Penggunaan Canva</w:t>
+            </w:r>
+          </w:p>
+        </w:tc>
+        <w:tc>
+          <w:tcPr>
+            <w:tcW w:w="1300" w:type="dxa"/>
+            <w:tcBorders>
+              <w:top w:val="single" w:sz="4" w:space="0" w:color="C9CFD8"/>
+              <w:left w:val="single" w:sz="4" w:space="0" w:color="C9CFD8"/>
+              <w:bottom w:val="single" w:sz="4" w:space="0" w:color="C9CFD8"/>
+              <w:right w:val="single" w:sz="4" w:space="0" w:color="C9CFD8"/>
+            </w:tcBorders>
+            <w:tcMar>
+              <w:top w:w="90" w:type="dxa"/>
+              <w:left w:w="120" w:type="dxa"/>
+              <w:bottom w:w="90" w:type="dxa"/>
+              <w:right w:w="120" w:type="dxa"/>
+            </w:tcMar>
+            <w:vAlign w:val="center"/>
+          </w:tcPr>
+          <w:p>
+            <w:pPr>
+              <w:spacing w:line="254" w:lineRule="auto"/>
+              <w:jc w:val="center"/>
+              <w:rPr>
+                <w:lang w:val="ms-MY"/>
+              </w:rPr>
+            </w:pPr>
+            <w:r>
+              <w:rPr>
+                <w:lang w:val="ms-MY"/>
+              </w:rPr>
+              <w:t>15</w:t>
+            </w:r>
+          </w:p>
+        </w:tc>
+        <w:tc>
+          <w:tcPr>
+            <w:tcW w:w="1500" w:type="dxa"/>
+            <w:tcBorders>
+              <w:top w:val="single" w:sz="4" w:space="0" w:color="C9CFD8"/>
+              <w:left w:val="single" w:sz="4" w:space="0" w:color="C9CFD8"/>
+              <w:bottom w:val="single" w:sz="4" w:space="0" w:color="C9CFD8"/>
+              <w:right w:val="single" w:sz="4" w:space="0" w:color="C9CFD8"/>
+            </w:tcBorders>
+            <w:tcMar>
+              <w:top w:w="90" w:type="dxa"/>
+              <w:left w:w="120" w:type="dxa"/>
+              <w:bottom w:w="90" w:type="dxa"/>
+              <w:right w:w="120" w:type="dxa"/>
+            </w:tcMar>
+            <w:vAlign w:val="center"/>
+          </w:tcPr>
+          <w:p>
+            <w:pPr>
+              <w:spacing w:line="254" w:lineRule="auto"/>
+              <w:jc w:val="center"/>
+              <w:rPr>
+                <w:lang w:val="ms-MY"/>
+              </w:rPr>
+            </w:pPr>
+            <w:r>
+              <w:rPr>
+                <w:lang w:val="ms-MY"/>
+              </w:rPr>
+              <w:t>3</w:t>
+            </w:r>
+          </w:p>
+        </w:tc>
+      </w:tr>
+      <w:tr>
+        <w:trPr>
+          <w:cantSplit/>
+          <w:trHeight w:val="432"/>
+        </w:trPr>
+        <w:tc>
+          <w:tcPr>
+            <w:tcW w:w="1400" w:type="dxa"/>
+            <w:tcBorders>
+              <w:top w:val="single" w:sz="4" w:space="0" w:color="C9CFD8"/>
+              <w:left w:val="single" w:sz="4" w:space="0" w:color="C9CFD8"/>
+              <w:bottom w:val="single" w:sz="4" w:space="0" w:color="C9CFD8"/>
+              <w:right w:val="single" w:sz="4" w:space="0" w:color="C9CFD8"/>
+            </w:tcBorders>
+            <w:shd w:val="clear" w:color="auto" w:fill="EBF0F7"/>
+            <w:tcMar>
+              <w:top w:w="90" w:type="dxa"/>
+              <w:left w:w="120" w:type="dxa"/>
+              <w:bottom w:w="90" w:type="dxa"/>
+              <w:right w:w="120" w:type="dxa"/>
+            </w:tcMar>
+            <w:vAlign w:val="center"/>
+          </w:tcPr>
+          <w:p>
+            <w:pPr>
+              <w:spacing w:line="254" w:lineRule="auto"/>
+              <w:jc w:val="center"/>
+              <w:rPr>
+                <w:lang w:val="ms-MY"/>
+              </w:rPr>
+            </w:pPr>
+            <w:r>
+              <w:rPr>
+                <w:lang w:val="ms-MY"/>
+              </w:rPr>
+              <w:t>4</w:t>
+            </w:r>
+          </w:p>
+        </w:tc>
+        <w:tc>
+          <w:tcPr>
+            <w:tcW w:w="4826" w:type="dxa"/>
+            <w:tcBorders>
+              <w:top w:val="single" w:sz="4" w:space="0" w:color="C9CFD8"/>
+              <w:left w:val="single" w:sz="4" w:space="0" w:color="C9CFD8"/>
+              <w:bottom w:val="single" w:sz="4" w:space="0" w:color="C9CFD8"/>
+              <w:right w:val="single" w:sz="4" w:space="0" w:color="C9CFD8"/>
+            </w:tcBorders>
+            <w:shd w:val="clear" w:color="auto" w:fill="EBF0F7"/>
+            <w:tcMar>
+              <w:top w:w="90" w:type="dxa"/>
+              <w:left w:w="120" w:type="dxa"/>
+              <w:bottom w:w="90" w:type="dxa"/>
+              <w:right w:w="120" w:type="dxa"/>
+            </w:tcMar>
+            <w:vAlign w:val="center"/>
+          </w:tcPr>
+          <w:p>
+            <w:pPr>
+              <w:spacing w:line="254" w:lineRule="auto"/>
+              <w:rPr>
+                <w:lang w:val="ms-MY"/>
+              </w:rPr>
+            </w:pPr>
+            <w:r>
+              <w:rPr>
+                <w:lang w:val="ms-MY"/>
+              </w:rPr>
+              <w:t>Penggunaan AI</w:t>
+            </w:r>
+          </w:p>
+        </w:tc>
+        <w:tc>
+          <w:tcPr>
+            <w:tcW w:w="1300" w:type="dxa"/>
+            <w:tcBorders>
+              <w:top w:val="single" w:sz="4" w:space="0" w:color="C9CFD8"/>
+              <w:left w:val="single" w:sz="4" w:space="0" w:color="C9CFD8"/>
+              <w:bottom w:val="single" w:sz="4" w:space="0" w:color="C9CFD8"/>
+              <w:right w:val="single" w:sz="4" w:space="0" w:color="C9CFD8"/>
+            </w:tcBorders>
+            <w:shd w:val="clear" w:color="auto" w:fill="EBF0F7"/>
+            <w:tcMar>
+              <w:top w:w="90" w:type="dxa"/>
+              <w:left w:w="120" w:type="dxa"/>
+              <w:bottom w:w="90" w:type="dxa"/>
+              <w:right w:w="120" w:type="dxa"/>
+            </w:tcMar>
+            <w:vAlign w:val="center"/>
+          </w:tcPr>
+          <w:p>
+            <w:pPr>
+              <w:spacing w:line="254" w:lineRule="auto"/>
+              <w:jc w:val="center"/>
+              <w:rPr>
+                <w:lang w:val="ms-MY"/>
+              </w:rPr>
+            </w:pPr>
+            <w:r>
+              <w:rPr>
+                <w:lang w:val="ms-MY"/>
+              </w:rPr>
+              <w:t>10</w:t>
+            </w:r>
+          </w:p>
+        </w:tc>
+        <w:tc>
+          <w:tcPr>
+            <w:tcW w:w="1500" w:type="dxa"/>
+            <w:tcBorders>
+              <w:top w:val="single" w:sz="4" w:space="0" w:color="C9CFD8"/>
+              <w:left w:val="single" w:sz="4" w:space="0" w:color="C9CFD8"/>
+              <w:bottom w:val="single" w:sz="4" w:space="0" w:color="C9CFD8"/>
+              <w:right w:val="single" w:sz="4" w:space="0" w:color="C9CFD8"/>
+            </w:tcBorders>
+            <w:shd w:val="clear" w:color="auto" w:fill="EBF0F7"/>
+            <w:tcMar>
+              <w:top w:w="90" w:type="dxa"/>
+              <w:left w:w="120" w:type="dxa"/>
+              <w:bottom w:w="90" w:type="dxa"/>
+              <w:right w:w="120" w:type="dxa"/>
+            </w:tcMar>
+            <w:vAlign w:val="center"/>
+          </w:tcPr>
+          <w:p>
+            <w:pPr>
+              <w:spacing w:line="254" w:lineRule="auto"/>
+              <w:jc w:val="center"/>
+              <w:rPr>
+                <w:lang w:val="ms-MY"/>
+              </w:rPr>
+            </w:pPr>
+            <w:r>
+              <w:rPr>
+                <w:lang w:val="ms-MY"/>
+              </w:rPr>
+              <w:t>4</w:t>
+            </w:r>
+          </w:p>
+        </w:tc>
+      </w:tr>
+      <w:tr>
+        <w:trPr>
+          <w:cantSplit/>
+          <w:trHeight w:val="432"/>
+        </w:trPr>
+        <w:tc>
+          <w:tcPr>
+            <w:tcW w:w="1400" w:type="dxa"/>
+            <w:tcBorders>
+              <w:top w:val="single" w:sz="4" w:space="0" w:color="C9CFD8"/>
+              <w:left w:val="single" w:sz="4" w:space="0" w:color="C9CFD8"/>
+              <w:bottom w:val="single" w:sz="4" w:space="0" w:color="C9CFD8"/>
+              <w:right w:val="single" w:sz="4" w:space="0" w:color="C9CFD8"/>
+            </w:tcBorders>
+            <w:tcMar>
+              <w:top w:w="90" w:type="dxa"/>
+              <w:left w:w="120" w:type="dxa"/>
+              <w:bottom w:w="90" w:type="dxa"/>
+              <w:right w:w="120" w:type="dxa"/>
+            </w:tcMar>
+            <w:vAlign w:val="center"/>
+          </w:tcPr>
+          <w:p>
+            <w:pPr>
+              <w:spacing w:line="254" w:lineRule="auto"/>
+              <w:jc w:val="center"/>
+              <w:rPr>
+                <w:lang w:val="ms-MY"/>
+              </w:rPr>
+            </w:pPr>
+            <w:r>
+              <w:rPr>
+                <w:lang w:val="ms-MY"/>
+              </w:rPr>
+              <w:t>5</w:t>
+            </w:r>
+          </w:p>
+        </w:tc>
+        <w:tc>
+          <w:tcPr>
+            <w:tcW w:w="4826" w:type="dxa"/>
+            <w:tcBorders>
+              <w:top w:val="single" w:sz="4" w:space="0" w:color="C9CFD8"/>
+              <w:left w:val="single" w:sz="4" w:space="0" w:color="C9CFD8"/>
+              <w:bottom w:val="single" w:sz="4" w:space="0" w:color="C9CFD8"/>
+              <w:right w:val="single" w:sz="4" w:space="0" w:color="C9CFD8"/>
+            </w:tcBorders>
+            <w:tcMar>
+              <w:top w:w="90" w:type="dxa"/>
+              <w:left w:w="120" w:type="dxa"/>
+              <w:bottom w:w="90" w:type="dxa"/>
+              <w:right w:w="120" w:type="dxa"/>
+            </w:tcMar>
+            <w:vAlign w:val="center"/>
+          </w:tcPr>
+          <w:p>
+            <w:pPr>
+              <w:spacing w:line="254" w:lineRule="auto"/>
+              <w:rPr>
+                <w:lang w:val="ms-MY"/>
+              </w:rPr>
+            </w:pPr>
+            <w:r>
+              <w:rPr>
+                <w:lang w:val="ms-MY"/>
+              </w:rPr>
+              <w:t>Suntingan CapCut dan video</w:t>
+            </w:r>
+          </w:p>
+        </w:tc>
+        <w:tc>
+          <w:tcPr>
+            <w:tcW w:w="1300" w:type="dxa"/>
+            <w:tcBorders>
+              <w:top w:val="single" w:sz="4" w:space="0" w:color="C9CFD8"/>
+              <w:left w:val="single" w:sz="4" w:space="0" w:color="C9CFD8"/>
+              <w:bottom w:val="single" w:sz="4" w:space="0" w:color="C9CFD8"/>
+              <w:right w:val="single" w:sz="4" w:space="0" w:color="C9CFD8"/>
+            </w:tcBorders>
+            <w:tcMar>
+              <w:top w:w="90" w:type="dxa"/>
+              <w:left w:w="120" w:type="dxa"/>
+              <w:bottom w:w="90" w:type="dxa"/>
+              <w:right w:w="120" w:type="dxa"/>
+            </w:tcMar>
+            <w:vAlign w:val="center"/>
+          </w:tcPr>
+          <w:p>
+            <w:pPr>
+              <w:spacing w:line="254" w:lineRule="auto"/>
+              <w:jc w:val="center"/>
+              <w:rPr>
+                <w:lang w:val="ms-MY"/>
+              </w:rPr>
+            </w:pPr>
+            <w:r>
+              <w:rPr>
+                <w:lang w:val="ms-MY"/>
+              </w:rPr>
+              <w:t>10</w:t>
+            </w:r>
+          </w:p>
+        </w:tc>
+        <w:tc>
+          <w:tcPr>
+            <w:tcW w:w="1500" w:type="dxa"/>
+            <w:tcBorders>
+              <w:top w:val="single" w:sz="4" w:space="0" w:color="C9CFD8"/>
+              <w:left w:val="single" w:sz="4" w:space="0" w:color="C9CFD8"/>
+              <w:bottom w:val="single" w:sz="4" w:space="0" w:color="C9CFD8"/>
+              <w:right w:val="single" w:sz="4" w:space="0" w:color="C9CFD8"/>
+            </w:tcBorders>
+            <w:tcMar>
+              <w:top w:w="90" w:type="dxa"/>
+              <w:left w:w="120" w:type="dxa"/>
+              <w:bottom w:w="90" w:type="dxa"/>
+              <w:right w:w="120" w:type="dxa"/>
+            </w:tcMar>
+            <w:vAlign w:val="center"/>
+          </w:tcPr>
+          <w:p>
+            <w:pPr>
+              <w:spacing w:line="254" w:lineRule="auto"/>
+              <w:jc w:val="center"/>
+              <w:rPr>
+                <w:lang w:val="ms-MY"/>
+              </w:rPr>
+            </w:pPr>
+            <w:r>
+              <w:rPr>
+                <w:lang w:val="ms-MY"/>
+              </w:rPr>
+              <w:t>5</w:t>
+            </w:r>
+          </w:p>
+        </w:tc>
+      </w:tr>
+      <w:tr>
+        <w:trPr>
+          <w:cantSplit/>
+          <w:trHeight w:val="432"/>
+        </w:trPr>
+        <w:tc>
+          <w:tcPr>
+            <w:tcW w:w="1400" w:type="dxa"/>
+            <w:tcBorders>
+              <w:top w:val="single" w:sz="4" w:space="0" w:color="C9CFD8"/>
+              <w:left w:val="single" w:sz="4" w:space="0" w:color="C9CFD8"/>
+              <w:bottom w:val="single" w:sz="4" w:space="0" w:color="C9CFD8"/>
+              <w:right w:val="single" w:sz="4" w:space="0" w:color="C9CFD8"/>
+            </w:tcBorders>
+            <w:shd w:val="clear" w:color="auto" w:fill="EBF0F7"/>
+            <w:tcMar>
+              <w:top w:w="90" w:type="dxa"/>
+              <w:left w:w="120" w:type="dxa"/>
+              <w:bottom w:w="90" w:type="dxa"/>
+              <w:right w:w="120" w:type="dxa"/>
+            </w:tcMar>
+            <w:vAlign w:val="center"/>
+          </w:tcPr>
+          <w:p>
+            <w:pPr>
+              <w:spacing w:line="254" w:lineRule="auto"/>
+              <w:jc w:val="center"/>
+              <w:rPr>
+                <w:lang w:val="ms-MY"/>
+              </w:rPr>
+            </w:pPr>
+            <w:r>
+              <w:rPr>
+                <w:lang w:val="ms-MY"/>
+              </w:rPr>
+              <w:t>6</w:t>
+            </w:r>
+          </w:p>
+        </w:tc>
+        <w:tc>
+          <w:tcPr>
+            <w:tcW w:w="4826" w:type="dxa"/>
+            <w:tcBorders>
+              <w:top w:val="single" w:sz="4" w:space="0" w:color="C9CFD8"/>
+              <w:left w:val="single" w:sz="4" w:space="0" w:color="C9CFD8"/>
+              <w:bottom w:val="single" w:sz="4" w:space="0" w:color="C9CFD8"/>
+              <w:right w:val="single" w:sz="4" w:space="0" w:color="C9CFD8"/>
+            </w:tcBorders>
+            <w:shd w:val="clear" w:color="auto" w:fill="EBF0F7"/>
+            <w:tcMar>
+              <w:top w:w="90" w:type="dxa"/>
+              <w:left w:w="120" w:type="dxa"/>
+              <w:bottom w:w="90" w:type="dxa"/>
+              <w:right w:w="120" w:type="dxa"/>
+            </w:tcMar>
+            <w:vAlign w:val="center"/>
+          </w:tcPr>
+          <w:p>
+            <w:pPr>
+              <w:spacing w:line="254" w:lineRule="auto"/>
+              <w:rPr>
+                <w:lang w:val="ms-MY"/>
+              </w:rPr>
+            </w:pPr>
+            <w:r>
+              <w:rPr>
+                <w:lang w:val="ms-MY"/>
+              </w:rPr>
+              <w:t>Audio: lagu, muzik, sound effects dan suara</w:t>
+            </w:r>
+          </w:p>
+        </w:tc>
+        <w:tc>
+          <w:tcPr>
+            <w:tcW w:w="1300" w:type="dxa"/>
+            <w:tcBorders>
+              <w:top w:val="single" w:sz="4" w:space="0" w:color="C9CFD8"/>
+              <w:left w:val="single" w:sz="4" w:space="0" w:color="C9CFD8"/>
+              <w:bottom w:val="single" w:sz="4" w:space="0" w:color="C9CFD8"/>
+              <w:right w:val="single" w:sz="4" w:space="0" w:color="C9CFD8"/>
+            </w:tcBorders>
+            <w:shd w:val="clear" w:color="auto" w:fill="EBF0F7"/>
+            <w:tcMar>
+              <w:top w:w="90" w:type="dxa"/>
+              <w:left w:w="120" w:type="dxa"/>
+              <w:bottom w:w="90" w:type="dxa"/>
+              <w:right w:w="120" w:type="dxa"/>
+            </w:tcMar>
+            <w:vAlign w:val="center"/>
+          </w:tcPr>
+          <w:p>
+            <w:pPr>
+              <w:spacing w:line="254" w:lineRule="auto"/>
+              <w:jc w:val="center"/>
+              <w:rPr>
+                <w:lang w:val="ms-MY"/>
+              </w:rPr>
+            </w:pPr>
+            <w:r>
+              <w:rPr>
+                <w:lang w:val="ms-MY"/>
+              </w:rPr>
+              <w:t>10</w:t>
+            </w:r>
+          </w:p>
+        </w:tc>
+        <w:tc>
+          <w:tcPr>
+            <w:tcW w:w="1500" w:type="dxa"/>
+            <w:tcBorders>
+              <w:top w:val="single" w:sz="4" w:space="0" w:color="C9CFD8"/>
+              <w:left w:val="single" w:sz="4" w:space="0" w:color="C9CFD8"/>
+              <w:bottom w:val="single" w:sz="4" w:space="0" w:color="C9CFD8"/>
+              <w:right w:val="single" w:sz="4" w:space="0" w:color="C9CFD8"/>
+            </w:tcBorders>
+            <w:shd w:val="clear" w:color="auto" w:fill="EBF0F7"/>
+            <w:tcMar>
+              <w:top w:w="90" w:type="dxa"/>
+              <w:left w:w="120" w:type="dxa"/>
+              <w:bottom w:w="90" w:type="dxa"/>
+              <w:right w:w="120" w:type="dxa"/>
+            </w:tcMar>
+            <w:vAlign w:val="center"/>
+          </w:tcPr>
+          <w:p>
+            <w:pPr>
+              <w:spacing w:line="254" w:lineRule="auto"/>
+              <w:jc w:val="center"/>
+              <w:rPr>
+                <w:lang w:val="ms-MY"/>
+              </w:rPr>
+            </w:pPr>
+            <w:r>
+              <w:rPr>
+                <w:lang w:val="ms-MY"/>
+              </w:rPr>
+              <w:t>6</w:t>
+            </w:r>
+          </w:p>
+        </w:tc>
+      </w:tr>
+      <w:tr>
+        <w:trPr>
+          <w:cantSplit/>
+          <w:trHeight w:val="432"/>
+        </w:trPr>
+        <w:tc>
+          <w:tcPr>
+            <w:tcW w:w="1400" w:type="dxa"/>
+            <w:tcBorders>
+              <w:top w:val="single" w:sz="4" w:space="0" w:color="C9CFD8"/>
+              <w:left w:val="single" w:sz="4" w:space="0" w:color="C9CFD8"/>
+              <w:bottom w:val="single" w:sz="4" w:space="0" w:color="C9CFD8"/>
+              <w:right w:val="single" w:sz="4" w:space="0" w:color="C9CFD8"/>
+            </w:tcBorders>
+            <w:tcMar>
+              <w:top w:w="90" w:type="dxa"/>
+              <w:left w:w="120" w:type="dxa"/>
+              <w:bottom w:w="90" w:type="dxa"/>
+              <w:right w:w="120" w:type="dxa"/>
+            </w:tcMar>
+            <w:vAlign w:val="center"/>
+          </w:tcPr>
+          <w:p>
+            <w:pPr>
+              <w:spacing w:line="254" w:lineRule="auto"/>
+              <w:jc w:val="center"/>
+              <w:rPr>
+                <w:lang w:val="ms-MY"/>
+              </w:rPr>
+            </w:pPr>
+            <w:r>
+              <w:rPr>
+                <w:lang w:val="ms-MY"/>
+              </w:rPr>
+              <w:t>7</w:t>
+            </w:r>
+          </w:p>
+        </w:tc>
+        <w:tc>
+          <w:tcPr>
+            <w:tcW w:w="4826" w:type="dxa"/>
+            <w:tcBorders>
+              <w:top w:val="single" w:sz="4" w:space="0" w:color="C9CFD8"/>
+              <w:left w:val="single" w:sz="4" w:space="0" w:color="C9CFD8"/>
+              <w:bottom w:val="single" w:sz="4" w:space="0" w:color="C9CFD8"/>
+              <w:right w:val="single" w:sz="4" w:space="0" w:color="C9CFD8"/>
+            </w:tcBorders>
+            <w:tcMar>
+              <w:top w:w="90" w:type="dxa"/>
+              <w:left w:w="120" w:type="dxa"/>
+              <w:bottom w:w="90" w:type="dxa"/>
+              <w:right w:w="120" w:type="dxa"/>
+            </w:tcMar>
+            <w:vAlign w:val="center"/>
+          </w:tcPr>
+          <w:p>
+            <w:pPr>
+              <w:spacing w:line="254" w:lineRule="auto"/>
+              <w:rPr>
+                <w:lang w:val="ms-MY"/>
+              </w:rPr>
+            </w:pPr>
+            <w:r>
+              <w:rPr>
+                <w:lang w:val="ms-MY"/>
+              </w:rPr>
+              <w:t>Persembahan dan soal jawab</w:t>
+            </w:r>
+          </w:p>
+        </w:tc>
+        <w:tc>
+          <w:tcPr>
+            <w:tcW w:w="1300" w:type="dxa"/>
+            <w:tcBorders>
+              <w:top w:val="single" w:sz="4" w:space="0" w:color="C9CFD8"/>
+              <w:left w:val="single" w:sz="4" w:space="0" w:color="C9CFD8"/>
+              <w:bottom w:val="single" w:sz="4" w:space="0" w:color="C9CFD8"/>
+              <w:right w:val="single" w:sz="4" w:space="0" w:color="C9CFD8"/>
+            </w:tcBorders>
+            <w:tcMar>
+              <w:top w:w="90" w:type="dxa"/>
+              <w:left w:w="120" w:type="dxa"/>
+              <w:bottom w:w="90" w:type="dxa"/>
+              <w:right w:w="120" w:type="dxa"/>
+            </w:tcMar>
+            <w:vAlign w:val="center"/>
+          </w:tcPr>
+          <w:p>
+            <w:pPr>
+              <w:spacing w:line="254" w:lineRule="auto"/>
+              <w:jc w:val="center"/>
+              <w:rPr>
+                <w:lang w:val="ms-MY"/>
+              </w:rPr>
+            </w:pPr>
+            <w:r>
+              <w:rPr>
+                <w:lang w:val="ms-MY"/>
+              </w:rPr>
+              <w:t>10</w:t>
+            </w:r>
+          </w:p>
+        </w:tc>
+        <w:tc>
+          <w:tcPr>
+            <w:tcW w:w="1500" w:type="dxa"/>
+            <w:tcBorders>
+              <w:top w:val="single" w:sz="4" w:space="0" w:color="C9CFD8"/>
+              <w:left w:val="single" w:sz="4" w:space="0" w:color="C9CFD8"/>
+              <w:bottom w:val="single" w:sz="4" w:space="0" w:color="C9CFD8"/>
+              <w:right w:val="single" w:sz="4" w:space="0" w:color="C9CFD8"/>
+            </w:tcBorders>
+            <w:tcMar>
+              <w:top w:w="90" w:type="dxa"/>
+              <w:left w:w="120" w:type="dxa"/>
+              <w:bottom w:w="90" w:type="dxa"/>
+              <w:right w:w="120" w:type="dxa"/>
+            </w:tcMar>
+            <w:vAlign w:val="center"/>
+          </w:tcPr>
+          <w:p>
+            <w:pPr>
+              <w:spacing w:line="254" w:lineRule="auto"/>
+              <w:jc w:val="center"/>
+              <w:rPr>
+                <w:lang w:val="ms-MY"/>
+              </w:rPr>
+            </w:pPr>
+            <w:r>
+              <w:rPr>
+                <w:lang w:val="ms-MY"/>
+              </w:rPr>
+              <w:t>8</w:t>
+            </w:r>
+          </w:p>
+        </w:tc>
+      </w:tr>
+      <w:tr>
+        <w:trPr>
+          <w:cantSplit/>
+          <w:trHeight w:val="432"/>
+        </w:trPr>
+        <w:tc>
+          <w:tcPr>
+            <w:tcW w:w="1400" w:type="dxa"/>
+            <w:tcBorders>
+              <w:top w:val="single" w:sz="4" w:space="0" w:color="C9CFD8"/>
+              <w:left w:val="single" w:sz="4" w:space="0" w:color="C9CFD8"/>
+              <w:bottom w:val="single" w:sz="4" w:space="0" w:color="C9CFD8"/>
+              <w:right w:val="single" w:sz="4" w:space="0" w:color="C9CFD8"/>
+            </w:tcBorders>
+            <w:shd w:val="clear" w:color="auto" w:fill="EBF0F7"/>
+            <w:tcMar>
+              <w:top w:w="90" w:type="dxa"/>
+              <w:left w:w="120" w:type="dxa"/>
+              <w:bottom w:w="90" w:type="dxa"/>
+              <w:right w:w="120" w:type="dxa"/>
+            </w:tcMar>
+            <w:vAlign w:val="center"/>
+          </w:tcPr>
+          <w:p>
+            <w:pPr>
+              <w:spacing w:line="254" w:lineRule="auto"/>
+              <w:jc w:val="center"/>
+              <w:rPr>
+                <w:lang w:val="ms-MY"/>
+              </w:rPr>
+            </w:pPr>
+            <w:r>
+              <w:rPr>
+                <w:lang w:val="ms-MY"/>
+              </w:rPr>
+              <w:t>8</w:t>
+            </w:r>
+          </w:p>
+        </w:tc>
+        <w:tc>
+          <w:tcPr>
+            <w:tcW w:w="4826" w:type="dxa"/>
+            <w:tcBorders>
+              <w:top w:val="single" w:sz="4" w:space="0" w:color="C9CFD8"/>
+              <w:left w:val="single" w:sz="4" w:space="0" w:color="C9CFD8"/>
+              <w:bottom w:val="single" w:sz="4" w:space="0" w:color="C9CFD8"/>
+              <w:right w:val="single" w:sz="4" w:space="0" w:color="C9CFD8"/>
+            </w:tcBorders>
+            <w:shd w:val="clear" w:color="auto" w:fill="EBF0F7"/>
+            <w:tcMar>
+              <w:top w:w="90" w:type="dxa"/>
+              <w:left w:w="120" w:type="dxa"/>
+              <w:bottom w:w="90" w:type="dxa"/>
+              <w:right w:w="120" w:type="dxa"/>
+            </w:tcMar>
+            <w:vAlign w:val="center"/>
+          </w:tcPr>
+          <w:p>
+            <w:pPr>
+              <w:spacing w:line="254" w:lineRule="auto"/>
+              <w:rPr>
+                <w:lang w:val="ms-MY"/>
+              </w:rPr>
+            </w:pPr>
+            <w:r>
+              <w:rPr>
+                <w:lang w:val="ms-MY"/>
+              </w:rPr>
+              <w:t>Etika, sumber dan deklarasi AI</w:t>
+            </w:r>
+          </w:p>
+        </w:tc>
+        <w:tc>
+          <w:tcPr>
+            <w:tcW w:w="1300" w:type="dxa"/>
+            <w:tcBorders>
+              <w:top w:val="single" w:sz="4" w:space="0" w:color="C9CFD8"/>
+              <w:left w:val="single" w:sz="4" w:space="0" w:color="C9CFD8"/>
+              <w:bottom w:val="single" w:sz="4" w:space="0" w:color="C9CFD8"/>
+              <w:right w:val="single" w:sz="4" w:space="0" w:color="C9CFD8"/>
+            </w:tcBorders>
+            <w:shd w:val="clear" w:color="auto" w:fill="EBF0F7"/>
+            <w:tcMar>
+              <w:top w:w="90" w:type="dxa"/>
+              <w:left w:w="120" w:type="dxa"/>
+              <w:bottom w:w="90" w:type="dxa"/>
+              <w:right w:w="120" w:type="dxa"/>
+            </w:tcMar>
+            <w:vAlign w:val="center"/>
+          </w:tcPr>
+          <w:p>
+            <w:pPr>
+              <w:spacing w:line="254" w:lineRule="auto"/>
+              <w:jc w:val="center"/>
+              <w:rPr>
+                <w:lang w:val="ms-MY"/>
+              </w:rPr>
+            </w:pPr>
+            <w:r>
+              <w:rPr>
+                <w:lang w:val="ms-MY"/>
+              </w:rPr>
+              <w:t>5</w:t>
+            </w:r>
+          </w:p>
+        </w:tc>
+        <w:tc>
+          <w:tcPr>
+            <w:tcW w:w="1500" w:type="dxa"/>
+            <w:tcBorders>
+              <w:top w:val="single" w:sz="4" w:space="0" w:color="C9CFD8"/>
+              <w:left w:val="single" w:sz="4" w:space="0" w:color="C9CFD8"/>
+              <w:bottom w:val="single" w:sz="4" w:space="0" w:color="C9CFD8"/>
+              <w:right w:val="single" w:sz="4" w:space="0" w:color="C9CFD8"/>
+            </w:tcBorders>
+            <w:shd w:val="clear" w:color="auto" w:fill="EBF0F7"/>
+            <w:tcMar>
+              <w:top w:w="90" w:type="dxa"/>
+              <w:left w:w="120" w:type="dxa"/>
+              <w:bottom w:w="90" w:type="dxa"/>
+              <w:right w:w="120" w:type="dxa"/>
+            </w:tcMar>
+            <w:vAlign w:val="center"/>
+          </w:tcPr>
+          <w:p>
+            <w:pPr>
+              <w:spacing w:line="254" w:lineRule="auto"/>
+              <w:jc w:val="center"/>
+              <w:rPr>
+                <w:lang w:val="ms-MY"/>
+              </w:rPr>
+            </w:pPr>
+            <w:r>
+              <w:rPr>
+                <w:lang w:val="ms-MY"/>
+              </w:rPr>
+              <w:t>7</w:t>
+            </w:r>
+          </w:p>
+        </w:tc>
+      </w:tr>
+      <w:tr>
+        <w:trPr>
+          <w:cantSplit/>
+          <w:trHeight w:val="432"/>
+        </w:trPr>
+        <w:tc>
+          <w:tcPr>
+            <w:tcW w:w="1400" w:type="dxa"/>
+            <w:tcBorders>
+              <w:top w:val="single" w:sz="4" w:space="0" w:color="C9CFD8"/>
+              <w:left w:val="single" w:sz="4" w:space="0" w:color="C9CFD8"/>
+              <w:bottom w:val="single" w:sz="4" w:space="0" w:color="C9CFD8"/>
+              <w:right w:val="single" w:sz="4" w:space="0" w:color="C9CFD8"/>
+            </w:tcBorders>
+            <w:tcMar>
+              <w:top w:w="90" w:type="dxa"/>
+              <w:left w:w="120" w:type="dxa"/>
+              <w:bottom w:w="90" w:type="dxa"/>
+              <w:right w:w="120" w:type="dxa"/>
+            </w:tcMar>
+            <w:vAlign w:val="center"/>
+          </w:tcPr>
+          <w:p>
+            <w:pPr>
+              <w:spacing w:line="254" w:lineRule="auto"/>
+              <w:jc w:val="center"/>
+              <w:rPr>
+                <w:lang w:val="ms-MY"/>
+              </w:rPr>
+            </w:pPr>
+            <w:r>
+              <w:rPr>
+                <w:lang w:val="ms-MY"/>
+              </w:rPr>
+              <w:t>9</w:t>
+            </w:r>
+          </w:p>
+        </w:tc>
+        <w:tc>
+          <w:tcPr>
+            <w:tcW w:w="4826" w:type="dxa"/>
+            <w:tcBorders>
+              <w:top w:val="single" w:sz="4" w:space="0" w:color="C9CFD8"/>
+              <w:left w:val="single" w:sz="4" w:space="0" w:color="C9CFD8"/>
+              <w:bottom w:val="single" w:sz="4" w:space="0" w:color="C9CFD8"/>
+              <w:right w:val="single" w:sz="4" w:space="0" w:color="C9CFD8"/>
+            </w:tcBorders>
+            <w:tcMar>
+              <w:top w:w="90" w:type="dxa"/>
+              <w:left w:w="120" w:type="dxa"/>
+              <w:bottom w:w="90" w:type="dxa"/>
+              <w:right w:w="120" w:type="dxa"/>
+            </w:tcMar>
+            <w:vAlign w:val="center"/>
+          </w:tcPr>
+          <w:p>
+            <w:pPr>
+              <w:spacing w:line="254" w:lineRule="auto"/>
+              <w:rPr>
+                <w:lang w:val="ms-MY"/>
+              </w:rPr>
+            </w:pPr>
+            <w:r>
+              <w:rPr>
+                <w:lang w:val="ms-MY"/>
+              </w:rPr>
+              <w:t>Watak AURORA</w:t>
+            </w:r>
+          </w:p>
+        </w:tc>
+        <w:tc>
+          <w:tcPr>
+            <w:tcW w:w="1300" w:type="dxa"/>
+            <w:tcBorders>
+              <w:top w:val="single" w:sz="4" w:space="0" w:color="C9CFD8"/>
+              <w:left w:val="single" w:sz="4" w:space="0" w:color="C9CFD8"/>
+              <w:bottom w:val="single" w:sz="4" w:space="0" w:color="C9CFD8"/>
+              <w:right w:val="single" w:sz="4" w:space="0" w:color="C9CFD8"/>
+            </w:tcBorders>
+            <w:tcMar>
+              <w:top w:w="90" w:type="dxa"/>
+              <w:left w:w="120" w:type="dxa"/>
+              <w:bottom w:w="90" w:type="dxa"/>
+              <w:right w:w="120" w:type="dxa"/>
+            </w:tcMar>
+            <w:vAlign w:val="center"/>
+          </w:tcPr>
+          <w:p>
+            <w:pPr>
+              <w:spacing w:line="254" w:lineRule="auto"/>
+              <w:jc w:val="center"/>
+              <w:rPr>
+                <w:lang w:val="ms-MY"/>
+              </w:rPr>
+            </w:pPr>
+            <w:r>
+              <w:rPr>
+                <w:lang w:val="ms-MY"/>
+              </w:rPr>
+              <w:t>5</w:t>
+            </w:r>
+          </w:p>
+        </w:tc>
+        <w:tc>
+          <w:tcPr>
+            <w:tcW w:w="1500" w:type="dxa"/>
+            <w:tcBorders>
+              <w:top w:val="single" w:sz="4" w:space="0" w:color="C9CFD8"/>
+              <w:left w:val="single" w:sz="4" w:space="0" w:color="C9CFD8"/>
+              <w:bottom w:val="single" w:sz="4" w:space="0" w:color="C9CFD8"/>
+              <w:right w:val="single" w:sz="4" w:space="0" w:color="C9CFD8"/>
+            </w:tcBorders>
+            <w:tcMar>
+              <w:top w:w="90" w:type="dxa"/>
+              <w:left w:w="120" w:type="dxa"/>
+              <w:bottom w:w="90" w:type="dxa"/>
+              <w:right w:w="120" w:type="dxa"/>
+            </w:tcMar>
+            <w:vAlign w:val="center"/>
+          </w:tcPr>
+          <w:p>
+            <w:pPr>
+              <w:spacing w:line="254" w:lineRule="auto"/>
+              <w:jc w:val="center"/>
+              <w:rPr>
+                <w:lang w:val="ms-MY"/>
+              </w:rPr>
+            </w:pPr>
+            <w:r>
+              <w:rPr>
+                <w:lang w:val="ms-MY"/>
+              </w:rPr>
+              <w:t>9</w:t>
+            </w:r>
+          </w:p>
+        </w:tc>
+      </w:tr>
+    </w:tbl>
+    <w:p>
+      <w:pPr>
+        <w:spacing w:after="60"/>
+        <w:rPr>
+          <w:lang w:val="ms-MY"/>
+        </w:rPr>
+      </w:pPr>
+    </w:p>
+    <w:p>
+      <w:pPr>
+        <w:tabs>
+          <w:tab w:val="left" w:pos="720"/>
+        </w:tabs>
+        <w:spacing w:before="60" w:after="130" w:line="320" w:lineRule="auto"/>
+        <w:ind w:left="720" w:hanging="720"/>
+        <w:jc w:val="both"/>
+        <w:rPr>
+          <w:lang w:val="ms-MY"/>
+        </w:rPr>
+      </w:pPr>
+      <w:r>
+        <w:rPr>
+          <w:b/>
+          <w:bCs/>
+          <w:color w:val="1F4E79"/>
+          <w:lang w:val="ms-MY"/>
+        </w:rPr>
+        <w:t>17.4</w:t>
+      </w:r>
+      <w:r>
+        <w:rPr>
+          <w:lang w:val="ms-MY"/>
+        </w:rPr>
+        <w:tab/>
+        <w:t xml:space="preserve">Jumlah markah komponen ialah markah yang diberikan oleh hakim selepas penalti peringkat komponen dalam Seksyen 16 diambil kira, iaitu penalti yang menetapkan markah komponen Audio, Watak AURORA atau Kandungan, fakta dan mesej kepada sifar, serta pemotongan markah komponen Etika dan Persembahan. Penalti peringkat jumlah tidak diambil kira sekali lagi kerana telah ditolak daripada markah akhir.</w:t>
+      </w:r>
+    </w:p>
+    <w:p>
+      <w:pPr>
+        <w:tabs>
+          <w:tab w:val="left" w:pos="720"/>
+        </w:tabs>
+        <w:spacing w:before="60" w:after="130" w:line="320" w:lineRule="auto"/>
+        <w:ind w:left="720" w:hanging="720"/>
+        <w:jc w:val="both"/>
+        <w:rPr>
+          <w:lang w:val="ms-MY"/>
+        </w:rPr>
+      </w:pPr>
+      <w:r>
+        <w:rPr>
+          <w:b/>
+          <w:bCs/>
+          <w:color w:val="1F4E79"/>
+          <w:lang w:val="ms-MY"/>
+        </w:rPr>
+        <w:t>17.5</w:t>
+      </w:r>
+      <w:r>
+        <w:rPr>
+          <w:lang w:val="ms-MY"/>
+        </w:rPr>
+        <w:tab/>
+        <w:t xml:space="preserve">Sekiranya jumlah markah kesemua sembilan komponen masih sama, kumpulan berkenaan berkongsi kedudukan yang sama. Panel hakim berbincang secara kolektif untuk membuat keputusan muktamad. Keputusan panel direkodkan secara bertulis dan disahkan oleh dua orang urus setia sebelum diumumkan.</w:t>
+      </w:r>
+    </w:p>
+    <w:p>
+      <w:pPr>
+        <w:tabs>
+          <w:tab w:val="left" w:pos="720"/>
+        </w:tabs>
+        <w:spacing w:before="60" w:after="130" w:line="320" w:lineRule="auto"/>
+        <w:ind w:left="720" w:hanging="720"/>
+        <w:jc w:val="both"/>
+        <w:rPr>
+          <w:lang w:val="ms-MY"/>
+        </w:rPr>
+      </w:pPr>
+      <w:r>
+        <w:rPr>
+          <w:b/>
+          <w:bCs/>
+          <w:color w:val="1F4E79"/>
+          <w:lang w:val="ms-MY"/>
+        </w:rPr>
+        <w:t>17.6</w:t>
+      </w:r>
+      <w:r>
+        <w:rPr>
+          <w:lang w:val="ms-MY"/>
+        </w:rPr>
+        <w:tab/>
+        <w:t xml:space="preserve">Pengiraan dalam perenggan 17.2 hingga 17.4 dibuat secara automatik oleh sistem penjurian. Setiap seri yang dileraikan dicatat dalam jejak audit bersama komponen yang menentukannya dan dimuatkan dalam laporan keputusan.</w:t>
       </w:r>
     </w:p>
     <w:p/>

</xml_diff>

<commit_message>
Portal: Borang Festival (15 borang berasingan) dan 01 Garis Panduan Pusingan 43
- borang/: 15 DOCX + 15 PDF Borang Festival (sama MD5 dengan 00_SEMASA/04_Borang_Festival), ZIP set lengkap, pratonton.jpg
- borang/index.html: senarai 15 fail (Lihat, PDF, DOCX), tema Dark dan Light sama dengan portal, baris sama tinggi pada semua lebar skrin
- index.html: kad ke-8 "Borang Festival CDKK" selepas kad Borang Pertandingan (grid 2 lajur kini 4 baris penuh)
- 01 Garis Panduan (docx, pdf 31 muka): TABIKA KEMAS huruf besar (2 tempat). MD5 docx 539ff384, pdf 3649e6d5

Co-Authored-By: Claude Opus 5.5 <noreply@anthropic.com>
Claude-Session: https://claude.ai/code/session_01B4ZXcZKZZemw5Hy6h3gC3G
</commit_message>
<xml_diff>
--- a/01_Garis_Panduan_CDKK.docx
+++ b/01_Garis_Panduan_CDKK.docx
@@ -4009,7 +4009,7 @@
           <w:lang w:val="ms-MY"/>
         </w:rPr>
         <w:tab/>
-        <w:t>Bagi pertandingan ini, watak AURORA hadir dalam dua varian mengikut kategori subjek pasukan. Pasukan kategori Usahawan dan Pameran Dan Demonstrasi menjana AURORA Dewasa berusia 20-an sebagai seorang peserta Kelas Kemahiran KEMAS, manakala pasukan kategori Alpha Gen Talents menjana AURORA Kanak-Kanak sebagai peserta Tabika KEMAS. Kedua-dua varian dijana menggunakan teknologi AI berdasarkan aset rujukan rasmi yang dibekalkan penganjur.</w:t>
+        <w:t>Bagi pertandingan ini, watak AURORA hadir dalam dua varian mengikut kategori subjek pasukan. Pasukan kategori Usahawan dan Pameran Dan Demonstrasi menjana AURORA Dewasa berusia 20-an sebagai seorang peserta Kelas Kemahiran KEMAS, manakala pasukan kategori Alpha Gen Talents menjana AURORA Kanak-Kanak sebagai peserta TABIKA KEMAS. Kedua-dua varian dijana menggunakan teknologi AI berdasarkan aset rujukan rasmi yang dibekalkan penganjur.</w:t>
       </w:r>
     </w:p>
     <w:p>
@@ -7510,7 +7510,7 @@
               <w:rPr>
                 <w:lang w:val="ms-MY"/>
               </w:rPr>
-              <w:t>Watak AURORA yang sepadan dengan kategori pasukan WAJIB muncul dalam video dengan peranan bermakna. Pasukan kategori Usahawan dan Pameran Dan Demonstrasi menjana AURORA Dewasa, iaitu wanita berusia 20-an peserta Kelas Kemahiran KEMAS yang memakai tudung, manakala pasukan kategori Alpha Gen Talents menjana AURORA Kanak-Kanak, iaitu kanak-kanak perempuan peserta Tabika KEMAS. Rupa dijana menggunakan teknologi AI berdasarkan aset rujukan rasmi / soul pack yang dibekalkan penganjur (pek aset AURORA).</w:t>
+              <w:t>Watak AURORA yang sepadan dengan kategori pasukan WAJIB muncul dalam video dengan peranan bermakna. Pasukan kategori Usahawan dan Pameran Dan Demonstrasi menjana AURORA Dewasa, iaitu wanita berusia 20-an peserta Kelas Kemahiran KEMAS yang memakai tudung, manakala pasukan kategori Alpha Gen Talents menjana AURORA Kanak-Kanak, iaitu kanak-kanak perempuan peserta TABIKA KEMAS. Rupa dijana menggunakan teknologi AI berdasarkan aset rujukan rasmi / soul pack yang dibekalkan penganjur (pek aset AURORA).</w:t>
             </w:r>
           </w:p>
         </w:tc>

</xml_diff>

<commit_message>
Pusingan 44: Garis Panduan versi Oktober 2026 sebagai SSOT, rajah 480 minit
Arahan Bro 25 Okt 2026 (K1 hingga K4 A):
- Klausa "Nota Kursus ialah rujukan muktamad" diganti: Garis Panduan versi
  Oktober 2026 ialah dokumen rujukan muktamad dan terpakai jika bercanggah.
- Rajah lapuk dibina semula: Urutan Hari Pertandingan (pelan sprint 480 minit,
  Borang 5), Enam Belas Kategori Penalti (Borang 4), Agihan 100 Markah
  (Lampiran 6 Nota Kursus), infografik CapCut (480, 56, 432, 10-18 Mbps).
- Kulit Garis Panduan: OKTOBER 2026.

Portal Dokumen: 01 docx/pdf, 02 pdf, 04 docx/pdf, borang/ (Indeks, Rujukan 2,
ZIP set lengkap, label Pusingan 44) dan gp/ dijana semula daripada 01 baharu.

Co-Authored-By: Claude Opus 5.5 <noreply@anthropic.com>
Claude-Session: https://claude.ai/code/session_01B4ZXcZKZZemw5Hy6h3gC3G
</commit_message>
<xml_diff>
--- a/01_Garis_Panduan_CDKK.docx
+++ b/01_Garis_Panduan_CDKK.docx
@@ -89,7 +89,7 @@
                 <w:color w:val="1F4E79"/>
                 <w:lang w:val="ms-MY"/>
               </w:rPr>
-              <w:t>OGOS</w:t>
+              <w:t>OKTOBER</w:t>
             </w:r>
           </w:p>
           <w:p>
@@ -696,7 +696,7 @@
                 <w:szCs w:val="19"/>
                 <w:lang w:val="ms-MY"/>
               </w:rPr>
-              <w:t>22 seksyen utama. Garis Panduan ini hendaklah dibaca bersama Nota Kursus Bengkel CDKK 2026. Nota Kursus ialah dokumen rujukan muktamad, dan sekiranya berlaku sebarang percanggahan antara Garis Panduan ini dengan Nota Kursus, Nota Kursus yang terpakai.</w:t>
+              <w:t>22 seksyen utama. Garis Panduan ini ialah dokumen rujukan muktamad dan hendaklah dibaca bersama Nota Kursus Bengkel CDKK 2026. Sekiranya berlaku sebarang percanggahan antara Garis Panduan ini dengan Nota Kursus, Garis Panduan ini yang terpakai.</w:t>
             </w:r>
           </w:p>
         </w:tc>
@@ -20621,7 +20621,7 @@
           <w:color w:val="1F4E79"/>
           <w:lang w:val="ms-MY"/>
         </w:rPr>
-        <w:t>Garis Panduan ini merumuskan peraturan pertandingan. Butiran pelaksanaan, kaedah kerja dan deskriptor penilaian yang lengkap dinyatakan dalam Nota Kursus Bengkel CDKK 2026, yang merupakan dokumen rujukan muktamad.</w:t>
+        <w:t>Garis Panduan ini menetapkan peraturan pertandingan dan merupakan dokumen rujukan muktamad. Butiran pelaksanaan, kaedah kerja dan deskriptor penilaian yang lengkap dinyatakan dalam Nota Kursus Bengkel CDKK 2026 dan hendaklah dibaca selari dengan Garis Panduan ini.</w:t>
       </w:r>
       <w:r>
         <w:rPr>
@@ -20993,7 +20993,7 @@
                 <w:color w:val="1F4E79"/>
                 <w:lang w:val="ms-MY"/>
               </w:rPr>
-              <w:t>Nota Kursus ialah rujukan muktamad</w:t>
+              <w:t>Garis Panduan ialah rujukan muktamad</w:t>
             </w:r>
           </w:p>
           <w:p>
@@ -21008,7 +21008,7 @@
               <w:rPr>
                 <w:lang w:val="ms-MY"/>
               </w:rPr>
-              <w:t>Sekiranya berlaku sebarang percanggahan antara mana-mana dokumen dalam kit CDKK, termasuk Garis Panduan ini, dengan Nota Kursus Bengkel CDKK 2026, Nota Kursus yang terpakai. Sebarang pindaan hendaklah ditolak turun ke kesemua dokumen kit pada hari yang sama.</w:t>
+              <w:t>Sekiranya berlaku sebarang percanggahan antara mana-mana dokumen dalam kit CDKK, termasuk Nota Kursus Bengkel CDKK 2026, dengan Garis Panduan ini, Garis Panduan ini yang terpakai. Sebarang pindaan hendaklah dibuat dalam Garis Panduan terlebih dahulu dan ditolak turun ke kesemua dokumen kit pada hari yang sama.</w:t>
             </w:r>
           </w:p>
         </w:tc>

</xml_diff>